<commit_message>
Tighten the 赫里翁 Word report layout to save paper
Sections now flow continuously instead of each starting a new page,
margins are slightly smaller, photos sit three to a row, and the site
plan moves into the floor-plan section. Headings stay with their
content and KPI rows no longer split. 9 pages → 8, no half-empty pages
except the last.

Co-Authored-By: Claude Opus 5.5 <noreply@anthropic.com>
Claude-Session: https://claude.ai/code/session_017uqsg19nxtidsM2JYVULqr
</commit_message>
<xml_diff>
--- a/deliverables/赫里翁/赫里翁_銷售報告書.docx
+++ b/deliverables/赫里翁/赫里翁_銷售報告書.docx
@@ -4,13 +4,14 @@
   <w:body>
     <w:p>
       <w:pPr>
+        <w:keepNext w:val="false"/>
         <w:spacing w:before="80"/>
         <w:jc w:val="center"/>
       </w:pPr>
       <w:r>
         <w:drawing>
           <wp:inline distT="0" distB="0" distL="0" distR="0">
-            <wp:extent cx="4857750" cy="3152775"/>
+            <wp:extent cx="3962400" cy="2571750"/>
             <wp:effectExtent t="0" r="0" b="0" l="0"/>
             <wp:docPr id="1" name="" descr="" title=""/>
             <wp:cNvGraphicFramePr>
@@ -35,7 +36,7 @@
                   <pic:spPr bwMode="auto">
                     <a:xfrm>
                       <a:off x="0" y="0"/>
-                      <a:ext cx="4857750" cy="3152775"/>
+                      <a:ext cx="3962400" cy="2571750"/>
                     </a:xfrm>
                     <a:prstGeom prst="rect">
                       <a:avLst/>
@@ -50,6 +51,7 @@
     </w:p>
     <w:p>
       <w:pPr>
+        <w:keepNext/>
         <w:spacing w:after="60" w:before="0"/>
       </w:pPr>
       <w:r>
@@ -497,12 +499,14 @@
       </w:r>
     </w:p>
     <w:p>
-      <w:r>
-        <w:br w:type="page"/>
-      </w:r>
+      <w:pPr>
+        <w:keepNext/>
+        <w:spacing w:before="240"/>
+      </w:pPr>
     </w:p>
     <w:p>
       <w:pPr>
+        <w:keepNext/>
         <w:spacing w:after="60" w:before="0"/>
       </w:pPr>
       <w:r>
@@ -518,6 +522,7 @@
     </w:p>
     <w:p>
       <w:pPr>
+        <w:keepNext/>
         <w:pBdr>
           <w:left w:val="single" w:color="C8963E" w:sz="36" w:space="8"/>
         </w:pBdr>
@@ -559,6 +564,9 @@
         <w:gridCol w:w="1924"/>
       </w:tblGrid>
       <w:tr>
+        <w:trPr>
+          <w:cantSplit/>
+        </w:trPr>
         <w:tc>
           <w:tcPr>
             <w:tcW w:type="dxa" w:w="1922"/>
@@ -2306,6 +2314,652 @@
         </w:tc>
       </w:tr>
     </w:tbl>
+    <w:tbl>
+      <w:tblPr>
+        <w:tblW w:type="dxa" w:w="10092"/>
+        <w:tblBorders>
+          <w:top w:val="none" w:color="FFFFFF" w:sz="0"/>
+          <w:left w:val="none" w:color="FFFFFF" w:sz="0"/>
+          <w:bottom w:val="none" w:color="FFFFFF" w:sz="0"/>
+          <w:right w:val="none" w:color="FFFFFF" w:sz="0"/>
+          <w:insideH w:val="none" w:color="FFFFFF" w:sz="0"/>
+          <w:insideV w:val="none" w:color="FFFFFF" w:sz="0"/>
+        </w:tblBorders>
+      </w:tblPr>
+      <w:tblGrid>
+        <w:gridCol w:w="10092"/>
+      </w:tblGrid>
+      <w:tr>
+        <w:trPr>
+          <w:cantSplit/>
+        </w:trPr>
+        <w:tc>
+          <w:tcPr>
+            <w:tcW w:type="dxa" w:w="10092"/>
+            <w:tcBorders>
+              <w:top w:val="none" w:color="FFFFFF" w:sz="0"/>
+              <w:left w:val="none" w:color="FFFFFF" w:sz="0"/>
+              <w:bottom w:val="none" w:color="FFFFFF" w:sz="0"/>
+              <w:right w:val="none" w:color="FFFFFF" w:sz="0"/>
+            </w:tcBorders>
+            <w:tcMar>
+              <w:top w:type="dxa" w:w="0"/>
+              <w:left w:type="dxa" w:w="80"/>
+              <w:bottom w:type="dxa" w:w="0"/>
+              <w:right w:type="dxa" w:w="80"/>
+            </w:tcMar>
+            <w:vAlign w:val="center"/>
+          </w:tcPr>
+          <w:p>
+            <w:pPr>
+              <w:keepNext/>
+              <w:spacing w:before="240"/>
+            </w:pPr>
+          </w:p>
+          <w:p>
+            <w:pPr>
+              <w:keepNext/>
+              <w:spacing w:after="60" w:before="0"/>
+            </w:pPr>
+            <w:r>
+              <w:rPr>
+                <w:rFonts w:ascii="Microsoft JhengHei" w:cs="Microsoft JhengHei" w:eastAsia="Microsoft JhengHei" w:hAnsi="Microsoft JhengHei"/>
+                <w:color w:val="C8963E"/>
+                <w:spacing w:val="60"/>
+                <w:sz w:val="15"/>
+                <w:szCs w:val="15"/>
+              </w:rPr>
+              <w:t xml:space="preserve">02 · INTERIOR</w:t>
+            </w:r>
+          </w:p>
+          <w:p>
+            <w:pPr>
+              <w:keepNext/>
+              <w:pBdr>
+                <w:left w:val="single" w:color="C8963E" w:sz="36" w:space="8"/>
+              </w:pBdr>
+              <w:spacing w:after="160"/>
+            </w:pPr>
+            <w:r>
+              <w:rPr>
+                <w:rFonts w:ascii="Microsoft JhengHei" w:cs="Microsoft JhengHei" w:eastAsia="Microsoft JhengHei" w:hAnsi="Microsoft JhengHei"/>
+                <w:b/>
+                <w:bCs/>
+                <w:color w:val="163A47"/>
+                <w:sz w:val="36"/>
+                <w:szCs w:val="36"/>
+              </w:rPr>
+              <w:t xml:space="preserve">實景照片</w:t>
+            </w:r>
+          </w:p>
+          <w:p>
+            <w:pPr>
+              <w:spacing w:after="100" w:line="300"/>
+            </w:pPr>
+            <w:r>
+              <w:rPr>
+                <w:rFonts w:ascii="Microsoft JhengHei" w:cs="Microsoft JhengHei" w:eastAsia="Microsoft JhengHei" w:hAnsi="Microsoft JhengHei"/>
+                <w:color w:val="5D6B76"/>
+                <w:sz w:val="19"/>
+                <w:szCs w:val="19"/>
+              </w:rPr>
+              <w:t xml:space="preserve">本戶現況照片，裝潢、家具與家電依實際點交為準。</w:t>
+            </w:r>
+          </w:p>
+          <w:tbl>
+            <w:tblPr>
+              <w:tblW w:type="dxa" w:w="10092"/>
+              <w:tblBorders>
+                <w:top w:val="none" w:color="FFFFFF" w:sz="0"/>
+                <w:left w:val="none" w:color="FFFFFF" w:sz="0"/>
+                <w:bottom w:val="none" w:color="FFFFFF" w:sz="0"/>
+                <w:right w:val="none" w:color="FFFFFF" w:sz="0"/>
+                <w:insideH w:val="none" w:color="FFFFFF" w:sz="0"/>
+                <w:insideV w:val="none" w:color="FFFFFF" w:sz="0"/>
+              </w:tblBorders>
+            </w:tblPr>
+            <w:tblGrid>
+              <w:gridCol w:w="3364"/>
+              <w:gridCol w:w="3364"/>
+              <w:gridCol w:w="3364"/>
+            </w:tblGrid>
+            <w:tr>
+              <w:trPr>
+                <w:cantSplit/>
+              </w:trPr>
+              <w:tc>
+                <w:tcPr>
+                  <w:tcW w:type="dxa" w:w="3364"/>
+                  <w:tcBorders>
+                    <w:top w:val="none" w:color="FFFFFF" w:sz="0"/>
+                    <w:left w:val="none" w:color="FFFFFF" w:sz="0"/>
+                    <w:bottom w:val="none" w:color="FFFFFF" w:sz="0"/>
+                    <w:right w:val="none" w:color="FFFFFF" w:sz="0"/>
+                  </w:tcBorders>
+                  <w:tcMar>
+                    <w:top w:type="dxa" w:w="50"/>
+                    <w:left w:type="dxa" w:w="80"/>
+                    <w:bottom w:type="dxa" w:w="50"/>
+                    <w:right w:type="dxa" w:w="80"/>
+                  </w:tcMar>
+                  <w:vAlign w:val="top"/>
+                </w:tcPr>
+                <w:p>
+                  <w:pPr>
+                    <w:jc w:val="center"/>
+                  </w:pPr>
+                  <w:r>
+                    <w:drawing>
+                      <wp:inline distT="0" distB="0" distL="0" distR="0">
+                        <wp:extent cx="2019300" cy="1524000"/>
+                        <wp:effectExtent t="0" r="0" b="0" l="0"/>
+                        <wp:docPr id="1" name="" descr="" title=""/>
+                        <wp:cNvGraphicFramePr>
+                          <a:graphicFrameLocks xmlns:a="http://schemas.openxmlformats.org/drawingml/2006/main" noChangeAspect="1"/>
+                        </wp:cNvGraphicFramePr>
+                        <a:graphic xmlns:a="http://schemas.openxmlformats.org/drawingml/2006/main">
+                          <a:graphicData uri="http://schemas.openxmlformats.org/drawingml/2006/picture">
+                            <pic:pic xmlns:pic="http://schemas.openxmlformats.org/drawingml/2006/picture">
+                              <pic:nvPicPr>
+                                <pic:cNvPr id="0" name="" descr=""/>
+                                <pic:cNvPicPr>
+                                  <a:picLocks noChangeAspect="1" noChangeArrowheads="1"/>
+                                </pic:cNvPicPr>
+                              </pic:nvPicPr>
+                              <pic:blipFill>
+                                <a:blip r:embed="rId11" cstate="none"/>
+                                <a:srcRect/>
+                                <a:stretch>
+                                  <a:fillRect/>
+                                </a:stretch>
+                              </pic:blipFill>
+                              <pic:spPr bwMode="auto">
+                                <a:xfrm>
+                                  <a:off x="0" y="0"/>
+                                  <a:ext cx="2019300" cy="1524000"/>
+                                </a:xfrm>
+                                <a:prstGeom prst="rect">
+                                  <a:avLst/>
+                                </a:prstGeom>
+                              </pic:spPr>
+                            </pic:pic>
+                          </a:graphicData>
+                        </a:graphic>
+                      </wp:inline>
+                    </w:drawing>
+                  </w:r>
+                </w:p>
+                <w:p>
+                  <w:pPr>
+                    <w:spacing w:after="120" w:before="40"/>
+                  </w:pPr>
+                  <w:r>
+                    <w:rPr>
+                      <w:rFonts w:ascii="Microsoft JhengHei" w:cs="Microsoft JhengHei" w:eastAsia="Microsoft JhengHei" w:hAnsi="Microsoft JhengHei"/>
+                      <w:color w:val="5D6B76"/>
+                      <w:sz w:val="15"/>
+                      <w:szCs w:val="15"/>
+                    </w:rPr>
+                    <w:t xml:space="preserve">客廳：水晶燈、線板天花與間接照明，整面書櫃與展示櫃。</w:t>
+                  </w:r>
+                </w:p>
+              </w:tc>
+              <w:tc>
+                <w:tcPr>
+                  <w:tcW w:type="dxa" w:w="3364"/>
+                  <w:tcBorders>
+                    <w:top w:val="none" w:color="FFFFFF" w:sz="0"/>
+                    <w:left w:val="none" w:color="FFFFFF" w:sz="0"/>
+                    <w:bottom w:val="none" w:color="FFFFFF" w:sz="0"/>
+                    <w:right w:val="none" w:color="FFFFFF" w:sz="0"/>
+                  </w:tcBorders>
+                  <w:tcMar>
+                    <w:top w:type="dxa" w:w="50"/>
+                    <w:left w:type="dxa" w:w="80"/>
+                    <w:bottom w:type="dxa" w:w="50"/>
+                    <w:right w:type="dxa" w:w="80"/>
+                  </w:tcMar>
+                  <w:vAlign w:val="top"/>
+                </w:tcPr>
+                <w:p>
+                  <w:pPr>
+                    <w:jc w:val="center"/>
+                  </w:pPr>
+                  <w:r>
+                    <w:drawing>
+                      <wp:inline distT="0" distB="0" distL="0" distR="0">
+                        <wp:extent cx="2019300" cy="1533525"/>
+                        <wp:effectExtent t="0" r="0" b="0" l="0"/>
+                        <wp:docPr id="1" name="" descr="" title=""/>
+                        <wp:cNvGraphicFramePr>
+                          <a:graphicFrameLocks xmlns:a="http://schemas.openxmlformats.org/drawingml/2006/main" noChangeAspect="1"/>
+                        </wp:cNvGraphicFramePr>
+                        <a:graphic xmlns:a="http://schemas.openxmlformats.org/drawingml/2006/main">
+                          <a:graphicData uri="http://schemas.openxmlformats.org/drawingml/2006/picture">
+                            <pic:pic xmlns:pic="http://schemas.openxmlformats.org/drawingml/2006/picture">
+                              <pic:nvPicPr>
+                                <pic:cNvPr id="0" name="" descr=""/>
+                                <pic:cNvPicPr>
+                                  <a:picLocks noChangeAspect="1" noChangeArrowheads="1"/>
+                                </pic:cNvPicPr>
+                              </pic:nvPicPr>
+                              <pic:blipFill>
+                                <a:blip r:embed="rId12" cstate="none"/>
+                                <a:srcRect/>
+                                <a:stretch>
+                                  <a:fillRect/>
+                                </a:stretch>
+                              </pic:blipFill>
+                              <pic:spPr bwMode="auto">
+                                <a:xfrm>
+                                  <a:off x="0" y="0"/>
+                                  <a:ext cx="2019300" cy="1533525"/>
+                                </a:xfrm>
+                                <a:prstGeom prst="rect">
+                                  <a:avLst/>
+                                </a:prstGeom>
+                              </pic:spPr>
+                            </pic:pic>
+                          </a:graphicData>
+                        </a:graphic>
+                      </wp:inline>
+                    </w:drawing>
+                  </w:r>
+                </w:p>
+                <w:p>
+                  <w:pPr>
+                    <w:spacing w:after="120" w:before="40"/>
+                  </w:pPr>
+                  <w:r>
+                    <w:rPr>
+                      <w:rFonts w:ascii="Microsoft JhengHei" w:cs="Microsoft JhengHei" w:eastAsia="Microsoft JhengHei" w:hAnsi="Microsoft JhengHei"/>
+                      <w:color w:val="5D6B76"/>
+                      <w:sz w:val="15"/>
+                      <w:szCs w:val="15"/>
+                    </w:rPr>
+                    <w:t xml:space="preserve">餐廳：圓桌區連開放式廚房中島，牆面整排收納櫃。</w:t>
+                  </w:r>
+                </w:p>
+              </w:tc>
+              <w:tc>
+                <w:tcPr>
+                  <w:tcW w:type="dxa" w:w="3364"/>
+                  <w:tcBorders>
+                    <w:top w:val="none" w:color="FFFFFF" w:sz="0"/>
+                    <w:left w:val="none" w:color="FFFFFF" w:sz="0"/>
+                    <w:bottom w:val="none" w:color="FFFFFF" w:sz="0"/>
+                    <w:right w:val="none" w:color="FFFFFF" w:sz="0"/>
+                  </w:tcBorders>
+                  <w:tcMar>
+                    <w:top w:type="dxa" w:w="50"/>
+                    <w:left w:type="dxa" w:w="80"/>
+                    <w:bottom w:type="dxa" w:w="50"/>
+                    <w:right w:type="dxa" w:w="80"/>
+                  </w:tcMar>
+                  <w:vAlign w:val="top"/>
+                </w:tcPr>
+                <w:p>
+                  <w:pPr>
+                    <w:jc w:val="center"/>
+                  </w:pPr>
+                  <w:r>
+                    <w:drawing>
+                      <wp:inline distT="0" distB="0" distL="0" distR="0">
+                        <wp:extent cx="2019300" cy="1504950"/>
+                        <wp:effectExtent t="0" r="0" b="0" l="0"/>
+                        <wp:docPr id="1" name="" descr="" title=""/>
+                        <wp:cNvGraphicFramePr>
+                          <a:graphicFrameLocks xmlns:a="http://schemas.openxmlformats.org/drawingml/2006/main" noChangeAspect="1"/>
+                        </wp:cNvGraphicFramePr>
+                        <a:graphic xmlns:a="http://schemas.openxmlformats.org/drawingml/2006/main">
+                          <a:graphicData uri="http://schemas.openxmlformats.org/drawingml/2006/picture">
+                            <pic:pic xmlns:pic="http://schemas.openxmlformats.org/drawingml/2006/picture">
+                              <pic:nvPicPr>
+                                <pic:cNvPr id="0" name="" descr=""/>
+                                <pic:cNvPicPr>
+                                  <a:picLocks noChangeAspect="1" noChangeArrowheads="1"/>
+                                </pic:cNvPicPr>
+                              </pic:nvPicPr>
+                              <pic:blipFill>
+                                <a:blip r:embed="rId13" cstate="none"/>
+                                <a:srcRect/>
+                                <a:stretch>
+                                  <a:fillRect/>
+                                </a:stretch>
+                              </pic:blipFill>
+                              <pic:spPr bwMode="auto">
+                                <a:xfrm>
+                                  <a:off x="0" y="0"/>
+                                  <a:ext cx="2019300" cy="1504950"/>
+                                </a:xfrm>
+                                <a:prstGeom prst="rect">
+                                  <a:avLst/>
+                                </a:prstGeom>
+                              </pic:spPr>
+                            </pic:pic>
+                          </a:graphicData>
+                        </a:graphic>
+                      </wp:inline>
+                    </w:drawing>
+                  </w:r>
+                </w:p>
+                <w:p>
+                  <w:pPr>
+                    <w:spacing w:after="120" w:before="40"/>
+                  </w:pPr>
+                  <w:r>
+                    <w:rPr>
+                      <w:rFonts w:ascii="Microsoft JhengHei" w:cs="Microsoft JhengHei" w:eastAsia="Microsoft JhengHei" w:hAnsi="Microsoft JhengHei"/>
+                      <w:color w:val="5D6B76"/>
+                      <w:sz w:val="15"/>
+                      <w:szCs w:val="15"/>
+                    </w:rPr>
+                    <w:t xml:space="preserve">廚房：一字型廚具、洗碗機與電器櫃，門外為工作陽台。</w:t>
+                  </w:r>
+                </w:p>
+              </w:tc>
+            </w:tr>
+          </w:tbl>
+          <w:p/>
+        </w:tc>
+      </w:tr>
+    </w:tbl>
+    <w:tbl>
+      <w:tblPr>
+        <w:tblW w:type="dxa" w:w="10092"/>
+        <w:tblBorders>
+          <w:top w:val="none" w:color="FFFFFF" w:sz="0"/>
+          <w:left w:val="none" w:color="FFFFFF" w:sz="0"/>
+          <w:bottom w:val="none" w:color="FFFFFF" w:sz="0"/>
+          <w:right w:val="none" w:color="FFFFFF" w:sz="0"/>
+          <w:insideH w:val="none" w:color="FFFFFF" w:sz="0"/>
+          <w:insideV w:val="none" w:color="FFFFFF" w:sz="0"/>
+        </w:tblBorders>
+      </w:tblPr>
+      <w:tblGrid>
+        <w:gridCol w:w="3364"/>
+        <w:gridCol w:w="3364"/>
+        <w:gridCol w:w="3364"/>
+      </w:tblGrid>
+      <w:tr>
+        <w:trPr>
+          <w:cantSplit/>
+        </w:trPr>
+        <w:tc>
+          <w:tcPr>
+            <w:tcW w:type="dxa" w:w="3364"/>
+            <w:tcBorders>
+              <w:top w:val="none" w:color="FFFFFF" w:sz="0"/>
+              <w:left w:val="none" w:color="FFFFFF" w:sz="0"/>
+              <w:bottom w:val="none" w:color="FFFFFF" w:sz="0"/>
+              <w:right w:val="none" w:color="FFFFFF" w:sz="0"/>
+            </w:tcBorders>
+            <w:tcMar>
+              <w:top w:type="dxa" w:w="50"/>
+              <w:left w:type="dxa" w:w="80"/>
+              <w:bottom w:type="dxa" w:w="50"/>
+              <w:right w:type="dxa" w:w="80"/>
+            </w:tcMar>
+            <w:vAlign w:val="top"/>
+          </w:tcPr>
+          <w:p>
+            <w:pPr>
+              <w:jc w:val="center"/>
+            </w:pPr>
+            <w:r>
+              <w:drawing>
+                <wp:inline distT="0" distB="0" distL="0" distR="0">
+                  <wp:extent cx="2019300" cy="1504950"/>
+                  <wp:effectExtent t="0" r="0" b="0" l="0"/>
+                  <wp:docPr id="1" name="" descr="" title=""/>
+                  <wp:cNvGraphicFramePr>
+                    <a:graphicFrameLocks xmlns:a="http://schemas.openxmlformats.org/drawingml/2006/main" noChangeAspect="1"/>
+                  </wp:cNvGraphicFramePr>
+                  <a:graphic xmlns:a="http://schemas.openxmlformats.org/drawingml/2006/main">
+                    <a:graphicData uri="http://schemas.openxmlformats.org/drawingml/2006/picture">
+                      <pic:pic xmlns:pic="http://schemas.openxmlformats.org/drawingml/2006/picture">
+                        <pic:nvPicPr>
+                          <pic:cNvPr id="0" name="" descr=""/>
+                          <pic:cNvPicPr>
+                            <a:picLocks noChangeAspect="1" noChangeArrowheads="1"/>
+                          </pic:cNvPicPr>
+                        </pic:nvPicPr>
+                        <pic:blipFill>
+                          <a:blip r:embed="rId14" cstate="none"/>
+                          <a:srcRect/>
+                          <a:stretch>
+                            <a:fillRect/>
+                          </a:stretch>
+                        </pic:blipFill>
+                        <pic:spPr bwMode="auto">
+                          <a:xfrm>
+                            <a:off x="0" y="0"/>
+                            <a:ext cx="2019300" cy="1504950"/>
+                          </a:xfrm>
+                          <a:prstGeom prst="rect">
+                            <a:avLst/>
+                          </a:prstGeom>
+                        </pic:spPr>
+                      </pic:pic>
+                    </a:graphicData>
+                  </a:graphic>
+                </wp:inline>
+              </w:drawing>
+            </w:r>
+          </w:p>
+          <w:p>
+            <w:pPr>
+              <w:spacing w:after="120" w:before="40"/>
+            </w:pPr>
+            <w:r>
+              <w:rPr>
+                <w:rFonts w:ascii="Microsoft JhengHei" w:cs="Microsoft JhengHei" w:eastAsia="Microsoft JhengHei" w:hAnsi="Microsoft JhengHei"/>
+                <w:color w:val="5D6B76"/>
+                <w:sz w:val="15"/>
+                <w:szCs w:val="15"/>
+              </w:rPr>
+              <w:t xml:space="preserve">主臥：繃布床頭牆、窗邊臥榻收納，木地板。</w:t>
+            </w:r>
+          </w:p>
+        </w:tc>
+        <w:tc>
+          <w:tcPr>
+            <w:tcW w:type="dxa" w:w="3364"/>
+            <w:tcBorders>
+              <w:top w:val="none" w:color="FFFFFF" w:sz="0"/>
+              <w:left w:val="none" w:color="FFFFFF" w:sz="0"/>
+              <w:bottom w:val="none" w:color="FFFFFF" w:sz="0"/>
+              <w:right w:val="none" w:color="FFFFFF" w:sz="0"/>
+            </w:tcBorders>
+            <w:tcMar>
+              <w:top w:type="dxa" w:w="50"/>
+              <w:left w:type="dxa" w:w="80"/>
+              <w:bottom w:type="dxa" w:w="50"/>
+              <w:right w:type="dxa" w:w="80"/>
+            </w:tcMar>
+            <w:vAlign w:val="top"/>
+          </w:tcPr>
+          <w:p>
+            <w:pPr>
+              <w:jc w:val="center"/>
+            </w:pPr>
+            <w:r>
+              <w:drawing>
+                <wp:inline distT="0" distB="0" distL="0" distR="0">
+                  <wp:extent cx="2019300" cy="1314450"/>
+                  <wp:effectExtent t="0" r="0" b="0" l="0"/>
+                  <wp:docPr id="1" name="" descr="" title=""/>
+                  <wp:cNvGraphicFramePr>
+                    <a:graphicFrameLocks xmlns:a="http://schemas.openxmlformats.org/drawingml/2006/main" noChangeAspect="1"/>
+                  </wp:cNvGraphicFramePr>
+                  <a:graphic xmlns:a="http://schemas.openxmlformats.org/drawingml/2006/main">
+                    <a:graphicData uri="http://schemas.openxmlformats.org/drawingml/2006/picture">
+                      <pic:pic xmlns:pic="http://schemas.openxmlformats.org/drawingml/2006/picture">
+                        <pic:nvPicPr>
+                          <pic:cNvPr id="0" name="" descr=""/>
+                          <pic:cNvPicPr>
+                            <a:picLocks noChangeAspect="1" noChangeArrowheads="1"/>
+                          </pic:cNvPicPr>
+                        </pic:nvPicPr>
+                        <pic:blipFill>
+                          <a:blip r:embed="rId15" cstate="none"/>
+                          <a:srcRect/>
+                          <a:stretch>
+                            <a:fillRect/>
+                          </a:stretch>
+                        </pic:blipFill>
+                        <pic:spPr bwMode="auto">
+                          <a:xfrm>
+                            <a:off x="0" y="0"/>
+                            <a:ext cx="2019300" cy="1314450"/>
+                          </a:xfrm>
+                          <a:prstGeom prst="rect">
+                            <a:avLst/>
+                          </a:prstGeom>
+                        </pic:spPr>
+                      </pic:pic>
+                    </a:graphicData>
+                  </a:graphic>
+                </wp:inline>
+              </w:drawing>
+            </w:r>
+          </w:p>
+          <w:p>
+            <w:pPr>
+              <w:spacing w:after="120" w:before="40"/>
+            </w:pPr>
+            <w:r>
+              <w:rPr>
+                <w:rFonts w:ascii="Microsoft JhengHei" w:cs="Microsoft JhengHei" w:eastAsia="Microsoft JhengHei" w:hAnsi="Microsoft JhengHei"/>
+                <w:color w:val="5D6B76"/>
+                <w:sz w:val="15"/>
+                <w:szCs w:val="15"/>
+              </w:rPr>
+              <w:t xml:space="preserve">主衛浴：乾濕分離、淋浴間加浴缸，浴缸旁開窗、暖風機。</w:t>
+            </w:r>
+          </w:p>
+        </w:tc>
+        <w:tc>
+          <w:tcPr>
+            <w:tcW w:type="dxa" w:w="3364"/>
+            <w:tcBorders>
+              <w:top w:val="none" w:color="FFFFFF" w:sz="0"/>
+              <w:left w:val="none" w:color="FFFFFF" w:sz="0"/>
+              <w:bottom w:val="none" w:color="FFFFFF" w:sz="0"/>
+              <w:right w:val="none" w:color="FFFFFF" w:sz="0"/>
+            </w:tcBorders>
+            <w:tcMar>
+              <w:top w:type="dxa" w:w="50"/>
+              <w:left w:type="dxa" w:w="80"/>
+              <w:bottom w:type="dxa" w:w="50"/>
+              <w:right w:type="dxa" w:w="80"/>
+            </w:tcMar>
+            <w:vAlign w:val="top"/>
+          </w:tcPr>
+          <w:p>
+            <w:pPr>
+              <w:jc w:val="center"/>
+            </w:pPr>
+            <w:r>
+              <w:drawing>
+                <wp:inline distT="0" distB="0" distL="0" distR="0">
+                  <wp:extent cx="2019300" cy="1314450"/>
+                  <wp:effectExtent t="0" r="0" b="0" l="0"/>
+                  <wp:docPr id="1" name="" descr="" title=""/>
+                  <wp:cNvGraphicFramePr>
+                    <a:graphicFrameLocks xmlns:a="http://schemas.openxmlformats.org/drawingml/2006/main" noChangeAspect="1"/>
+                  </wp:cNvGraphicFramePr>
+                  <a:graphic xmlns:a="http://schemas.openxmlformats.org/drawingml/2006/main">
+                    <a:graphicData uri="http://schemas.openxmlformats.org/drawingml/2006/picture">
+                      <pic:pic xmlns:pic="http://schemas.openxmlformats.org/drawingml/2006/picture">
+                        <pic:nvPicPr>
+                          <pic:cNvPr id="0" name="" descr=""/>
+                          <pic:cNvPicPr>
+                            <a:picLocks noChangeAspect="1" noChangeArrowheads="1"/>
+                          </pic:cNvPicPr>
+                        </pic:nvPicPr>
+                        <pic:blipFill>
+                          <a:blip r:embed="rId8" cstate="none"/>
+                          <a:srcRect/>
+                          <a:stretch>
+                            <a:fillRect/>
+                          </a:stretch>
+                        </pic:blipFill>
+                        <pic:spPr bwMode="auto">
+                          <a:xfrm>
+                            <a:off x="0" y="0"/>
+                            <a:ext cx="2019300" cy="1314450"/>
+                          </a:xfrm>
+                          <a:prstGeom prst="rect">
+                            <a:avLst/>
+                          </a:prstGeom>
+                        </pic:spPr>
+                      </pic:pic>
+                    </a:graphicData>
+                  </a:graphic>
+                </wp:inline>
+              </w:drawing>
+            </w:r>
+          </w:p>
+          <w:p>
+            <w:pPr>
+              <w:spacing w:after="120" w:before="40"/>
+            </w:pPr>
+            <w:r>
+              <w:rPr>
+                <w:rFonts w:ascii="Microsoft JhengHei" w:cs="Microsoft JhengHei" w:eastAsia="Microsoft JhengHei" w:hAnsi="Microsoft JhengHei"/>
+                <w:color w:val="5D6B76"/>
+                <w:sz w:val="15"/>
+                <w:szCs w:val="15"/>
+              </w:rPr>
+              <w:t xml:space="preserve">社區外觀：雙塔新古典石材立面，拱門門廳。</w:t>
+            </w:r>
+          </w:p>
+        </w:tc>
+      </w:tr>
+    </w:tbl>
+    <w:p>
+      <w:pPr>
+        <w:keepNext/>
+        <w:spacing w:before="240"/>
+      </w:pPr>
+    </w:p>
+    <w:p>
+      <w:pPr>
+        <w:keepNext/>
+        <w:spacing w:after="60" w:before="0"/>
+      </w:pPr>
+      <w:r>
+        <w:rPr>
+          <w:rFonts w:ascii="Microsoft JhengHei" w:cs="Microsoft JhengHei" w:eastAsia="Microsoft JhengHei" w:hAnsi="Microsoft JhengHei"/>
+          <w:color w:val="C8963E"/>
+          <w:spacing w:val="60"/>
+          <w:sz w:val="15"/>
+          <w:szCs w:val="15"/>
+        </w:rPr>
+        <w:t xml:space="preserve">03 · FLOOR PLAN</w:t>
+      </w:r>
+    </w:p>
+    <w:p>
+      <w:pPr>
+        <w:keepNext/>
+        <w:pBdr>
+          <w:left w:val="single" w:color="C8963E" w:sz="36" w:space="8"/>
+        </w:pBdr>
+        <w:spacing w:after="160"/>
+      </w:pPr>
+      <w:r>
+        <w:rPr>
+          <w:rFonts w:ascii="Microsoft JhengHei" w:cs="Microsoft JhengHei" w:eastAsia="Microsoft JhengHei" w:hAnsi="Microsoft JhengHei"/>
+          <w:b/>
+          <w:bCs/>
+          <w:color w:val="163A47"/>
+          <w:sz w:val="36"/>
+          <w:szCs w:val="36"/>
+        </w:rPr>
+        <w:t xml:space="preserve">格局與六大賣點</w:t>
+      </w:r>
+    </w:p>
     <w:p>
       <w:pPr>
         <w:keepNext/>
@@ -2325,6 +2979,7 @@
     </w:p>
     <w:p>
       <w:pPr>
+        <w:keepNext/>
         <w:spacing w:before="80"/>
         <w:jc w:val="center"/>
       </w:pPr>
@@ -2347,7 +3002,7 @@
                     </pic:cNvPicPr>
                   </pic:nvPicPr>
                   <pic:blipFill>
-                    <a:blip r:embed="rId11" cstate="none"/>
+                    <a:blip r:embed="rId16" cstate="none"/>
                     <a:srcRect/>
                     <a:stretch>
                       <a:fillRect/>
@@ -2398,53 +3053,15 @@
       </w:r>
     </w:p>
     <w:p>
-      <w:r>
-        <w:br w:type="page"/>
-      </w:r>
-    </w:p>
-    <w:p>
       <w:pPr>
-        <w:spacing w:after="60" w:before="0"/>
-      </w:pPr>
-      <w:r>
-        <w:rPr>
-          <w:rFonts w:ascii="Microsoft JhengHei" w:cs="Microsoft JhengHei" w:eastAsia="Microsoft JhengHei" w:hAnsi="Microsoft JhengHei"/>
-          <w:color w:val="C8963E"/>
-          <w:spacing w:val="60"/>
-          <w:sz w:val="15"/>
-          <w:szCs w:val="15"/>
-        </w:rPr>
-        <w:t xml:space="preserve">02 · FLOOR PLAN</w:t>
-      </w:r>
-    </w:p>
-    <w:p>
-      <w:pPr>
-        <w:pBdr>
-          <w:left w:val="single" w:color="C8963E" w:sz="36" w:space="8"/>
-        </w:pBdr>
-        <w:spacing w:after="160"/>
-      </w:pPr>
-      <w:r>
-        <w:rPr>
-          <w:rFonts w:ascii="Microsoft JhengHei" w:cs="Microsoft JhengHei" w:eastAsia="Microsoft JhengHei" w:hAnsi="Microsoft JhengHei"/>
-          <w:b/>
-          <w:bCs/>
-          <w:color w:val="163A47"/>
-          <w:sz w:val="36"/>
-          <w:szCs w:val="36"/>
-        </w:rPr>
-        <w:t xml:space="preserve">格局與六大賣點</w:t>
-      </w:r>
-    </w:p>
-    <w:p>
-      <w:pPr>
+        <w:keepNext/>
         <w:spacing w:before="80"/>
         <w:jc w:val="center"/>
       </w:pPr>
       <w:r>
         <w:drawing>
           <wp:inline distT="0" distB="0" distL="0" distR="0">
-            <wp:extent cx="5400675" cy="4657725"/>
+            <wp:extent cx="3781425" cy="3257550"/>
             <wp:effectExtent t="0" r="0" b="0" l="0"/>
             <wp:docPr id="1" name="" descr="" title=""/>
             <wp:cNvGraphicFramePr>
@@ -2460,7 +3077,7 @@
                     </pic:cNvPicPr>
                   </pic:nvPicPr>
                   <pic:blipFill>
-                    <a:blip r:embed="rId12" cstate="none"/>
+                    <a:blip r:embed="rId17" cstate="none"/>
                     <a:srcRect/>
                     <a:stretch>
                       <a:fillRect/>
@@ -2469,7 +3086,7 @@
                   <pic:spPr bwMode="auto">
                     <a:xfrm>
                       <a:off x="0" y="0"/>
-                      <a:ext cx="5400675" cy="4657725"/>
+                      <a:ext cx="3781425" cy="3257550"/>
                     </a:xfrm>
                     <a:prstGeom prst="rect">
                       <a:avLst/>
@@ -2774,593 +3391,14 @@
       </w:r>
     </w:p>
     <w:p>
-      <w:r>
-        <w:br w:type="page"/>
-      </w:r>
+      <w:pPr>
+        <w:keepNext/>
+        <w:spacing w:before="240"/>
+      </w:pPr>
     </w:p>
     <w:p>
       <w:pPr>
-        <w:spacing w:after="60" w:before="0"/>
-      </w:pPr>
-      <w:r>
-        <w:rPr>
-          <w:rFonts w:ascii="Microsoft JhengHei" w:cs="Microsoft JhengHei" w:eastAsia="Microsoft JhengHei" w:hAnsi="Microsoft JhengHei"/>
-          <w:color w:val="C8963E"/>
-          <w:spacing w:val="60"/>
-          <w:sz w:val="15"/>
-          <w:szCs w:val="15"/>
-        </w:rPr>
-        <w:t xml:space="preserve">03 · INTERIOR</w:t>
-      </w:r>
-    </w:p>
-    <w:p>
-      <w:pPr>
-        <w:pBdr>
-          <w:left w:val="single" w:color="C8963E" w:sz="36" w:space="8"/>
-        </w:pBdr>
-        <w:spacing w:after="160"/>
-      </w:pPr>
-      <w:r>
-        <w:rPr>
-          <w:rFonts w:ascii="Microsoft JhengHei" w:cs="Microsoft JhengHei" w:eastAsia="Microsoft JhengHei" w:hAnsi="Microsoft JhengHei"/>
-          <w:b/>
-          <w:bCs/>
-          <w:color w:val="163A47"/>
-          <w:sz w:val="36"/>
-          <w:szCs w:val="36"/>
-        </w:rPr>
-        <w:t xml:space="preserve">實景照片</w:t>
-      </w:r>
-    </w:p>
-    <w:p>
-      <w:pPr>
-        <w:spacing w:after="100" w:line="300"/>
-      </w:pPr>
-      <w:r>
-        <w:rPr>
-          <w:rFonts w:ascii="Microsoft JhengHei" w:cs="Microsoft JhengHei" w:eastAsia="Microsoft JhengHei" w:hAnsi="Microsoft JhengHei"/>
-          <w:color w:val="5D6B76"/>
-          <w:sz w:val="19"/>
-          <w:szCs w:val="19"/>
-        </w:rPr>
-        <w:t xml:space="preserve">本戶現況照片，裝潢、家具與家電依實際點交為準。</w:t>
-      </w:r>
-    </w:p>
-    <w:tbl>
-      <w:tblPr>
-        <w:tblW w:type="dxa" w:w="10092"/>
-        <w:tblBorders>
-          <w:top w:val="none" w:color="FFFFFF" w:sz="0"/>
-          <w:left w:val="none" w:color="FFFFFF" w:sz="0"/>
-          <w:bottom w:val="none" w:color="FFFFFF" w:sz="0"/>
-          <w:right w:val="none" w:color="FFFFFF" w:sz="0"/>
-          <w:insideH w:val="none" w:color="FFFFFF" w:sz="0"/>
-          <w:insideV w:val="none" w:color="FFFFFF" w:sz="0"/>
-        </w:tblBorders>
-      </w:tblPr>
-      <w:tblGrid>
-        <w:gridCol w:w="5046"/>
-        <w:gridCol w:w="5046"/>
-      </w:tblGrid>
-      <w:tr>
-        <w:trPr>
-          <w:cantSplit/>
-        </w:trPr>
-        <w:tc>
-          <w:tcPr>
-            <w:tcW w:type="dxa" w:w="5046"/>
-            <w:tcBorders>
-              <w:top w:val="none" w:color="FFFFFF" w:sz="0"/>
-              <w:left w:val="none" w:color="FFFFFF" w:sz="0"/>
-              <w:bottom w:val="none" w:color="FFFFFF" w:sz="0"/>
-              <w:right w:val="none" w:color="FFFFFF" w:sz="0"/>
-            </w:tcBorders>
-            <w:tcMar>
-              <w:top w:type="dxa" w:w="50"/>
-              <w:left w:type="dxa" w:w="80"/>
-              <w:bottom w:type="dxa" w:w="50"/>
-              <w:right w:type="dxa" w:w="80"/>
-            </w:tcMar>
-            <w:vAlign w:val="top"/>
-          </w:tcPr>
-          <w:p>
-            <w:pPr>
-              <w:jc w:val="center"/>
-            </w:pPr>
-            <w:r>
-              <w:drawing>
-                <wp:inline distT="0" distB="0" distL="0" distR="0">
-                  <wp:extent cx="2990850" cy="2257425"/>
-                  <wp:effectExtent t="0" r="0" b="0" l="0"/>
-                  <wp:docPr id="1" name="" descr="" title=""/>
-                  <wp:cNvGraphicFramePr>
-                    <a:graphicFrameLocks xmlns:a="http://schemas.openxmlformats.org/drawingml/2006/main" noChangeAspect="1"/>
-                  </wp:cNvGraphicFramePr>
-                  <a:graphic xmlns:a="http://schemas.openxmlformats.org/drawingml/2006/main">
-                    <a:graphicData uri="http://schemas.openxmlformats.org/drawingml/2006/picture">
-                      <pic:pic xmlns:pic="http://schemas.openxmlformats.org/drawingml/2006/picture">
-                        <pic:nvPicPr>
-                          <pic:cNvPr id="0" name="" descr=""/>
-                          <pic:cNvPicPr>
-                            <a:picLocks noChangeAspect="1" noChangeArrowheads="1"/>
-                          </pic:cNvPicPr>
-                        </pic:nvPicPr>
-                        <pic:blipFill>
-                          <a:blip r:embed="rId13" cstate="none"/>
-                          <a:srcRect/>
-                          <a:stretch>
-                            <a:fillRect/>
-                          </a:stretch>
-                        </pic:blipFill>
-                        <pic:spPr bwMode="auto">
-                          <a:xfrm>
-                            <a:off x="0" y="0"/>
-                            <a:ext cx="2990850" cy="2257425"/>
-                          </a:xfrm>
-                          <a:prstGeom prst="rect">
-                            <a:avLst/>
-                          </a:prstGeom>
-                        </pic:spPr>
-                      </pic:pic>
-                    </a:graphicData>
-                  </a:graphic>
-                </wp:inline>
-              </w:drawing>
-            </w:r>
-          </w:p>
-          <w:p>
-            <w:pPr>
-              <w:spacing w:after="120" w:before="40"/>
-            </w:pPr>
-            <w:r>
-              <w:rPr>
-                <w:rFonts w:ascii="Microsoft JhengHei" w:cs="Microsoft JhengHei" w:eastAsia="Microsoft JhengHei" w:hAnsi="Microsoft JhengHei"/>
-                <w:color w:val="5D6B76"/>
-                <w:sz w:val="15"/>
-                <w:szCs w:val="15"/>
-              </w:rPr>
-              <w:t xml:space="preserve">客廳：水晶燈、線板天花與間接照明，整面書櫃與展示櫃。</w:t>
-            </w:r>
-          </w:p>
-        </w:tc>
-        <w:tc>
-          <w:tcPr>
-            <w:tcW w:type="dxa" w:w="5046"/>
-            <w:tcBorders>
-              <w:top w:val="none" w:color="FFFFFF" w:sz="0"/>
-              <w:left w:val="none" w:color="FFFFFF" w:sz="0"/>
-              <w:bottom w:val="none" w:color="FFFFFF" w:sz="0"/>
-              <w:right w:val="none" w:color="FFFFFF" w:sz="0"/>
-            </w:tcBorders>
-            <w:tcMar>
-              <w:top w:type="dxa" w:w="50"/>
-              <w:left w:type="dxa" w:w="80"/>
-              <w:bottom w:type="dxa" w:w="50"/>
-              <w:right w:type="dxa" w:w="80"/>
-            </w:tcMar>
-            <w:vAlign w:val="top"/>
-          </w:tcPr>
-          <w:p>
-            <w:pPr>
-              <w:jc w:val="center"/>
-            </w:pPr>
-            <w:r>
-              <w:drawing>
-                <wp:inline distT="0" distB="0" distL="0" distR="0">
-                  <wp:extent cx="2990850" cy="2276475"/>
-                  <wp:effectExtent t="0" r="0" b="0" l="0"/>
-                  <wp:docPr id="1" name="" descr="" title=""/>
-                  <wp:cNvGraphicFramePr>
-                    <a:graphicFrameLocks xmlns:a="http://schemas.openxmlformats.org/drawingml/2006/main" noChangeAspect="1"/>
-                  </wp:cNvGraphicFramePr>
-                  <a:graphic xmlns:a="http://schemas.openxmlformats.org/drawingml/2006/main">
-                    <a:graphicData uri="http://schemas.openxmlformats.org/drawingml/2006/picture">
-                      <pic:pic xmlns:pic="http://schemas.openxmlformats.org/drawingml/2006/picture">
-                        <pic:nvPicPr>
-                          <pic:cNvPr id="0" name="" descr=""/>
-                          <pic:cNvPicPr>
-                            <a:picLocks noChangeAspect="1" noChangeArrowheads="1"/>
-                          </pic:cNvPicPr>
-                        </pic:nvPicPr>
-                        <pic:blipFill>
-                          <a:blip r:embed="rId14" cstate="none"/>
-                          <a:srcRect/>
-                          <a:stretch>
-                            <a:fillRect/>
-                          </a:stretch>
-                        </pic:blipFill>
-                        <pic:spPr bwMode="auto">
-                          <a:xfrm>
-                            <a:off x="0" y="0"/>
-                            <a:ext cx="2990850" cy="2276475"/>
-                          </a:xfrm>
-                          <a:prstGeom prst="rect">
-                            <a:avLst/>
-                          </a:prstGeom>
-                        </pic:spPr>
-                      </pic:pic>
-                    </a:graphicData>
-                  </a:graphic>
-                </wp:inline>
-              </w:drawing>
-            </w:r>
-          </w:p>
-          <w:p>
-            <w:pPr>
-              <w:spacing w:after="120" w:before="40"/>
-            </w:pPr>
-            <w:r>
-              <w:rPr>
-                <w:rFonts w:ascii="Microsoft JhengHei" w:cs="Microsoft JhengHei" w:eastAsia="Microsoft JhengHei" w:hAnsi="Microsoft JhengHei"/>
-                <w:color w:val="5D6B76"/>
-                <w:sz w:val="15"/>
-                <w:szCs w:val="15"/>
-              </w:rPr>
-              <w:t xml:space="preserve">餐廳：圓桌區連開放式廚房中島，牆面整排收納櫃。</w:t>
-            </w:r>
-          </w:p>
-        </w:tc>
-      </w:tr>
-    </w:tbl>
-    <w:tbl>
-      <w:tblPr>
-        <w:tblW w:type="dxa" w:w="10092"/>
-        <w:tblBorders>
-          <w:top w:val="none" w:color="FFFFFF" w:sz="0"/>
-          <w:left w:val="none" w:color="FFFFFF" w:sz="0"/>
-          <w:bottom w:val="none" w:color="FFFFFF" w:sz="0"/>
-          <w:right w:val="none" w:color="FFFFFF" w:sz="0"/>
-          <w:insideH w:val="none" w:color="FFFFFF" w:sz="0"/>
-          <w:insideV w:val="none" w:color="FFFFFF" w:sz="0"/>
-        </w:tblBorders>
-      </w:tblPr>
-      <w:tblGrid>
-        <w:gridCol w:w="5046"/>
-        <w:gridCol w:w="5046"/>
-      </w:tblGrid>
-      <w:tr>
-        <w:trPr>
-          <w:cantSplit/>
-        </w:trPr>
-        <w:tc>
-          <w:tcPr>
-            <w:tcW w:type="dxa" w:w="5046"/>
-            <w:tcBorders>
-              <w:top w:val="none" w:color="FFFFFF" w:sz="0"/>
-              <w:left w:val="none" w:color="FFFFFF" w:sz="0"/>
-              <w:bottom w:val="none" w:color="FFFFFF" w:sz="0"/>
-              <w:right w:val="none" w:color="FFFFFF" w:sz="0"/>
-            </w:tcBorders>
-            <w:tcMar>
-              <w:top w:type="dxa" w:w="50"/>
-              <w:left w:type="dxa" w:w="80"/>
-              <w:bottom w:type="dxa" w:w="50"/>
-              <w:right w:type="dxa" w:w="80"/>
-            </w:tcMar>
-            <w:vAlign w:val="top"/>
-          </w:tcPr>
-          <w:p>
-            <w:pPr>
-              <w:jc w:val="center"/>
-            </w:pPr>
-            <w:r>
-              <w:drawing>
-                <wp:inline distT="0" distB="0" distL="0" distR="0">
-                  <wp:extent cx="2990850" cy="2228850"/>
-                  <wp:effectExtent t="0" r="0" b="0" l="0"/>
-                  <wp:docPr id="1" name="" descr="" title=""/>
-                  <wp:cNvGraphicFramePr>
-                    <a:graphicFrameLocks xmlns:a="http://schemas.openxmlformats.org/drawingml/2006/main" noChangeAspect="1"/>
-                  </wp:cNvGraphicFramePr>
-                  <a:graphic xmlns:a="http://schemas.openxmlformats.org/drawingml/2006/main">
-                    <a:graphicData uri="http://schemas.openxmlformats.org/drawingml/2006/picture">
-                      <pic:pic xmlns:pic="http://schemas.openxmlformats.org/drawingml/2006/picture">
-                        <pic:nvPicPr>
-                          <pic:cNvPr id="0" name="" descr=""/>
-                          <pic:cNvPicPr>
-                            <a:picLocks noChangeAspect="1" noChangeArrowheads="1"/>
-                          </pic:cNvPicPr>
-                        </pic:nvPicPr>
-                        <pic:blipFill>
-                          <a:blip r:embed="rId15" cstate="none"/>
-                          <a:srcRect/>
-                          <a:stretch>
-                            <a:fillRect/>
-                          </a:stretch>
-                        </pic:blipFill>
-                        <pic:spPr bwMode="auto">
-                          <a:xfrm>
-                            <a:off x="0" y="0"/>
-                            <a:ext cx="2990850" cy="2228850"/>
-                          </a:xfrm>
-                          <a:prstGeom prst="rect">
-                            <a:avLst/>
-                          </a:prstGeom>
-                        </pic:spPr>
-                      </pic:pic>
-                    </a:graphicData>
-                  </a:graphic>
-                </wp:inline>
-              </w:drawing>
-            </w:r>
-          </w:p>
-          <w:p>
-            <w:pPr>
-              <w:spacing w:after="120" w:before="40"/>
-            </w:pPr>
-            <w:r>
-              <w:rPr>
-                <w:rFonts w:ascii="Microsoft JhengHei" w:cs="Microsoft JhengHei" w:eastAsia="Microsoft JhengHei" w:hAnsi="Microsoft JhengHei"/>
-                <w:color w:val="5D6B76"/>
-                <w:sz w:val="15"/>
-                <w:szCs w:val="15"/>
-              </w:rPr>
-              <w:t xml:space="preserve">廚房：一字型廚具、洗碗機與電器櫃，門外為工作陽台。</w:t>
-            </w:r>
-          </w:p>
-        </w:tc>
-        <w:tc>
-          <w:tcPr>
-            <w:tcW w:type="dxa" w:w="5046"/>
-            <w:tcBorders>
-              <w:top w:val="none" w:color="FFFFFF" w:sz="0"/>
-              <w:left w:val="none" w:color="FFFFFF" w:sz="0"/>
-              <w:bottom w:val="none" w:color="FFFFFF" w:sz="0"/>
-              <w:right w:val="none" w:color="FFFFFF" w:sz="0"/>
-            </w:tcBorders>
-            <w:tcMar>
-              <w:top w:type="dxa" w:w="50"/>
-              <w:left w:type="dxa" w:w="80"/>
-              <w:bottom w:type="dxa" w:w="50"/>
-              <w:right w:type="dxa" w:w="80"/>
-            </w:tcMar>
-            <w:vAlign w:val="top"/>
-          </w:tcPr>
-          <w:p>
-            <w:pPr>
-              <w:jc w:val="center"/>
-            </w:pPr>
-            <w:r>
-              <w:drawing>
-                <wp:inline distT="0" distB="0" distL="0" distR="0">
-                  <wp:extent cx="2990850" cy="2238375"/>
-                  <wp:effectExtent t="0" r="0" b="0" l="0"/>
-                  <wp:docPr id="1" name="" descr="" title=""/>
-                  <wp:cNvGraphicFramePr>
-                    <a:graphicFrameLocks xmlns:a="http://schemas.openxmlformats.org/drawingml/2006/main" noChangeAspect="1"/>
-                  </wp:cNvGraphicFramePr>
-                  <a:graphic xmlns:a="http://schemas.openxmlformats.org/drawingml/2006/main">
-                    <a:graphicData uri="http://schemas.openxmlformats.org/drawingml/2006/picture">
-                      <pic:pic xmlns:pic="http://schemas.openxmlformats.org/drawingml/2006/picture">
-                        <pic:nvPicPr>
-                          <pic:cNvPr id="0" name="" descr=""/>
-                          <pic:cNvPicPr>
-                            <a:picLocks noChangeAspect="1" noChangeArrowheads="1"/>
-                          </pic:cNvPicPr>
-                        </pic:nvPicPr>
-                        <pic:blipFill>
-                          <a:blip r:embed="rId16" cstate="none"/>
-                          <a:srcRect/>
-                          <a:stretch>
-                            <a:fillRect/>
-                          </a:stretch>
-                        </pic:blipFill>
-                        <pic:spPr bwMode="auto">
-                          <a:xfrm>
-                            <a:off x="0" y="0"/>
-                            <a:ext cx="2990850" cy="2238375"/>
-                          </a:xfrm>
-                          <a:prstGeom prst="rect">
-                            <a:avLst/>
-                          </a:prstGeom>
-                        </pic:spPr>
-                      </pic:pic>
-                    </a:graphicData>
-                  </a:graphic>
-                </wp:inline>
-              </w:drawing>
-            </w:r>
-          </w:p>
-          <w:p>
-            <w:pPr>
-              <w:spacing w:after="120" w:before="40"/>
-            </w:pPr>
-            <w:r>
-              <w:rPr>
-                <w:rFonts w:ascii="Microsoft JhengHei" w:cs="Microsoft JhengHei" w:eastAsia="Microsoft JhengHei" w:hAnsi="Microsoft JhengHei"/>
-                <w:color w:val="5D6B76"/>
-                <w:sz w:val="15"/>
-                <w:szCs w:val="15"/>
-              </w:rPr>
-              <w:t xml:space="preserve">主臥：繃布床頭牆、窗邊臥榻收納，木地板。</w:t>
-            </w:r>
-          </w:p>
-        </w:tc>
-      </w:tr>
-    </w:tbl>
-    <w:tbl>
-      <w:tblPr>
-        <w:tblW w:type="dxa" w:w="10092"/>
-        <w:tblBorders>
-          <w:top w:val="none" w:color="FFFFFF" w:sz="0"/>
-          <w:left w:val="none" w:color="FFFFFF" w:sz="0"/>
-          <w:bottom w:val="none" w:color="FFFFFF" w:sz="0"/>
-          <w:right w:val="none" w:color="FFFFFF" w:sz="0"/>
-          <w:insideH w:val="none" w:color="FFFFFF" w:sz="0"/>
-          <w:insideV w:val="none" w:color="FFFFFF" w:sz="0"/>
-        </w:tblBorders>
-      </w:tblPr>
-      <w:tblGrid>
-        <w:gridCol w:w="5046"/>
-        <w:gridCol w:w="5046"/>
-      </w:tblGrid>
-      <w:tr>
-        <w:trPr>
-          <w:cantSplit/>
-        </w:trPr>
-        <w:tc>
-          <w:tcPr>
-            <w:tcW w:type="dxa" w:w="5046"/>
-            <w:tcBorders>
-              <w:top w:val="none" w:color="FFFFFF" w:sz="0"/>
-              <w:left w:val="none" w:color="FFFFFF" w:sz="0"/>
-              <w:bottom w:val="none" w:color="FFFFFF" w:sz="0"/>
-              <w:right w:val="none" w:color="FFFFFF" w:sz="0"/>
-            </w:tcBorders>
-            <w:tcMar>
-              <w:top w:type="dxa" w:w="50"/>
-              <w:left w:type="dxa" w:w="80"/>
-              <w:bottom w:type="dxa" w:w="50"/>
-              <w:right w:type="dxa" w:w="80"/>
-            </w:tcMar>
-            <w:vAlign w:val="top"/>
-          </w:tcPr>
-          <w:p>
-            <w:pPr>
-              <w:jc w:val="center"/>
-            </w:pPr>
-            <w:r>
-              <w:drawing>
-                <wp:inline distT="0" distB="0" distL="0" distR="0">
-                  <wp:extent cx="2990850" cy="1943100"/>
-                  <wp:effectExtent t="0" r="0" b="0" l="0"/>
-                  <wp:docPr id="1" name="" descr="" title=""/>
-                  <wp:cNvGraphicFramePr>
-                    <a:graphicFrameLocks xmlns:a="http://schemas.openxmlformats.org/drawingml/2006/main" noChangeAspect="1"/>
-                  </wp:cNvGraphicFramePr>
-                  <a:graphic xmlns:a="http://schemas.openxmlformats.org/drawingml/2006/main">
-                    <a:graphicData uri="http://schemas.openxmlformats.org/drawingml/2006/picture">
-                      <pic:pic xmlns:pic="http://schemas.openxmlformats.org/drawingml/2006/picture">
-                        <pic:nvPicPr>
-                          <pic:cNvPr id="0" name="" descr=""/>
-                          <pic:cNvPicPr>
-                            <a:picLocks noChangeAspect="1" noChangeArrowheads="1"/>
-                          </pic:cNvPicPr>
-                        </pic:nvPicPr>
-                        <pic:blipFill>
-                          <a:blip r:embed="rId17" cstate="none"/>
-                          <a:srcRect/>
-                          <a:stretch>
-                            <a:fillRect/>
-                          </a:stretch>
-                        </pic:blipFill>
-                        <pic:spPr bwMode="auto">
-                          <a:xfrm>
-                            <a:off x="0" y="0"/>
-                            <a:ext cx="2990850" cy="1943100"/>
-                          </a:xfrm>
-                          <a:prstGeom prst="rect">
-                            <a:avLst/>
-                          </a:prstGeom>
-                        </pic:spPr>
-                      </pic:pic>
-                    </a:graphicData>
-                  </a:graphic>
-                </wp:inline>
-              </w:drawing>
-            </w:r>
-          </w:p>
-          <w:p>
-            <w:pPr>
-              <w:spacing w:after="120" w:before="40"/>
-            </w:pPr>
-            <w:r>
-              <w:rPr>
-                <w:rFonts w:ascii="Microsoft JhengHei" w:cs="Microsoft JhengHei" w:eastAsia="Microsoft JhengHei" w:hAnsi="Microsoft JhengHei"/>
-                <w:color w:val="5D6B76"/>
-                <w:sz w:val="15"/>
-                <w:szCs w:val="15"/>
-              </w:rPr>
-              <w:t xml:space="preserve">主衛浴：乾濕分離、淋浴間加浴缸，浴缸旁開窗、暖風機。</w:t>
-            </w:r>
-          </w:p>
-        </w:tc>
-        <w:tc>
-          <w:tcPr>
-            <w:tcW w:type="dxa" w:w="5046"/>
-            <w:tcBorders>
-              <w:top w:val="none" w:color="FFFFFF" w:sz="0"/>
-              <w:left w:val="none" w:color="FFFFFF" w:sz="0"/>
-              <w:bottom w:val="none" w:color="FFFFFF" w:sz="0"/>
-              <w:right w:val="none" w:color="FFFFFF" w:sz="0"/>
-            </w:tcBorders>
-            <w:tcMar>
-              <w:top w:type="dxa" w:w="50"/>
-              <w:left w:type="dxa" w:w="80"/>
-              <w:bottom w:type="dxa" w:w="50"/>
-              <w:right w:type="dxa" w:w="80"/>
-            </w:tcMar>
-            <w:vAlign w:val="top"/>
-          </w:tcPr>
-          <w:p>
-            <w:pPr>
-              <w:jc w:val="center"/>
-            </w:pPr>
-            <w:r>
-              <w:drawing>
-                <wp:inline distT="0" distB="0" distL="0" distR="0">
-                  <wp:extent cx="2990850" cy="1943100"/>
-                  <wp:effectExtent t="0" r="0" b="0" l="0"/>
-                  <wp:docPr id="1" name="" descr="" title=""/>
-                  <wp:cNvGraphicFramePr>
-                    <a:graphicFrameLocks xmlns:a="http://schemas.openxmlformats.org/drawingml/2006/main" noChangeAspect="1"/>
-                  </wp:cNvGraphicFramePr>
-                  <a:graphic xmlns:a="http://schemas.openxmlformats.org/drawingml/2006/main">
-                    <a:graphicData uri="http://schemas.openxmlformats.org/drawingml/2006/picture">
-                      <pic:pic xmlns:pic="http://schemas.openxmlformats.org/drawingml/2006/picture">
-                        <pic:nvPicPr>
-                          <pic:cNvPr id="0" name="" descr=""/>
-                          <pic:cNvPicPr>
-                            <a:picLocks noChangeAspect="1" noChangeArrowheads="1"/>
-                          </pic:cNvPicPr>
-                        </pic:nvPicPr>
-                        <pic:blipFill>
-                          <a:blip r:embed="rId8" cstate="none"/>
-                          <a:srcRect/>
-                          <a:stretch>
-                            <a:fillRect/>
-                          </a:stretch>
-                        </pic:blipFill>
-                        <pic:spPr bwMode="auto">
-                          <a:xfrm>
-                            <a:off x="0" y="0"/>
-                            <a:ext cx="2990850" cy="1943100"/>
-                          </a:xfrm>
-                          <a:prstGeom prst="rect">
-                            <a:avLst/>
-                          </a:prstGeom>
-                        </pic:spPr>
-                      </pic:pic>
-                    </a:graphicData>
-                  </a:graphic>
-                </wp:inline>
-              </w:drawing>
-            </w:r>
-          </w:p>
-          <w:p>
-            <w:pPr>
-              <w:spacing w:after="120" w:before="40"/>
-            </w:pPr>
-            <w:r>
-              <w:rPr>
-                <w:rFonts w:ascii="Microsoft JhengHei" w:cs="Microsoft JhengHei" w:eastAsia="Microsoft JhengHei" w:hAnsi="Microsoft JhengHei"/>
-                <w:color w:val="5D6B76"/>
-                <w:sz w:val="15"/>
-                <w:szCs w:val="15"/>
-              </w:rPr>
-              <w:t xml:space="preserve">社區外觀：雙塔新古典石材立面，拱門門廳。</w:t>
-            </w:r>
-          </w:p>
-        </w:tc>
-      </w:tr>
-    </w:tbl>
-    <w:p>
-      <w:r>
-        <w:br w:type="page"/>
-      </w:r>
-    </w:p>
-    <w:p>
-      <w:pPr>
+        <w:keepNext/>
         <w:spacing w:after="60" w:before="0"/>
       </w:pPr>
       <w:r>
@@ -3376,6 +3414,7 @@
     </w:p>
     <w:p>
       <w:pPr>
+        <w:keepNext/>
         <w:pBdr>
           <w:left w:val="single" w:color="C8963E" w:sz="36" w:space="8"/>
         </w:pBdr>
@@ -5379,12 +5418,14 @@
       </w:r>
     </w:p>
     <w:p>
-      <w:r>
-        <w:br w:type="page"/>
-      </w:r>
+      <w:pPr>
+        <w:keepNext/>
+        <w:spacing w:before="240"/>
+      </w:pPr>
     </w:p>
     <w:p>
       <w:pPr>
+        <w:keepNext/>
         <w:spacing w:after="60" w:before="0"/>
       </w:pPr>
       <w:r>
@@ -5400,6 +5441,7 @@
     </w:p>
     <w:p>
       <w:pPr>
+        <w:keepNext/>
         <w:pBdr>
           <w:left w:val="single" w:color="C8963E" w:sz="36" w:space="8"/>
         </w:pBdr>
@@ -5433,6 +5475,7 @@
     </w:p>
     <w:p>
       <w:pPr>
+        <w:keepNext w:val="false"/>
         <w:spacing w:before="80"/>
         <w:jc w:val="center"/>
       </w:pPr>
@@ -15254,12 +15297,14 @@
       </w:r>
     </w:p>
     <w:p>
-      <w:r>
-        <w:br w:type="page"/>
-      </w:r>
+      <w:pPr>
+        <w:keepNext/>
+        <w:spacing w:before="240"/>
+      </w:pPr>
     </w:p>
     <w:p>
       <w:pPr>
+        <w:keepNext/>
         <w:spacing w:after="60" w:before="0"/>
       </w:pPr>
       <w:r>
@@ -15275,6 +15320,7 @@
     </w:p>
     <w:p>
       <w:pPr>
+        <w:keepNext/>
         <w:pBdr>
           <w:left w:val="single" w:color="C8963E" w:sz="36" w:space="8"/>
         </w:pBdr>
@@ -15454,6 +15500,9 @@
         <w:gridCol w:w="2433"/>
       </w:tblGrid>
       <w:tr>
+        <w:trPr>
+          <w:cantSplit/>
+        </w:trPr>
         <w:tc>
           <w:tcPr>
             <w:tcW w:type="dxa" w:w="2433"/>
@@ -19072,12 +19121,14 @@
       </w:r>
     </w:p>
     <w:p>
-      <w:r>
-        <w:br w:type="page"/>
-      </w:r>
+      <w:pPr>
+        <w:keepNext/>
+        <w:spacing w:before="240"/>
+      </w:pPr>
     </w:p>
     <w:p>
       <w:pPr>
+        <w:keepNext/>
         <w:spacing w:after="60" w:before="0"/>
       </w:pPr>
       <w:r>
@@ -19093,6 +19144,7 @@
     </w:p>
     <w:p>
       <w:pPr>
+        <w:keepNext/>
         <w:pBdr>
           <w:left w:val="single" w:color="C8963E" w:sz="36" w:space="8"/>
         </w:pBdr>
@@ -19146,6 +19198,9 @@
         <w:gridCol w:w="2433"/>
       </w:tblGrid>
       <w:tr>
+        <w:trPr>
+          <w:cantSplit/>
+        </w:trPr>
         <w:tc>
           <w:tcPr>
             <w:tcW w:type="dxa" w:w="2433"/>
@@ -21235,12 +21290,14 @@
       </w:r>
     </w:p>
     <w:p>
-      <w:r>
-        <w:br w:type="page"/>
-      </w:r>
+      <w:pPr>
+        <w:keepNext/>
+        <w:spacing w:before="240"/>
+      </w:pPr>
     </w:p>
     <w:p>
       <w:pPr>
+        <w:keepNext/>
         <w:spacing w:after="60" w:before="0"/>
       </w:pPr>
       <w:r>
@@ -21256,6 +21313,7 @@
     </w:p>
     <w:p>
       <w:pPr>
+        <w:keepNext/>
         <w:pBdr>
           <w:left w:val="single" w:color="C8963E" w:sz="36" w:space="8"/>
         </w:pBdr>
@@ -21295,6 +21353,9 @@
         <w:gridCol w:w="2433"/>
       </w:tblGrid>
       <w:tr>
+        <w:trPr>
+          <w:cantSplit/>
+        </w:trPr>
         <w:tc>
           <w:tcPr>
             <w:tcW w:type="dxa" w:w="2433"/>
@@ -24106,7 +24167,7 @@
     <w:sectPr>
       <w:footerReference w:type="default" r:id="rId7"/>
       <w:pgSz w:w="11906" w:h="16838" w:orient="portrait"/>
-      <w:pgMar w:top="850" w:right="907" w:bottom="1000" w:left="907" w:header="708" w:footer="400" w:gutter="0"/>
+      <w:pgMar w:top="620" w:right="907" w:bottom="900" w:left="907" w:header="708" w:footer="300" w:gutter="0"/>
       <w:pgNumType/>
       <w:docGrid w:linePitch="360"/>
     </w:sectPr>

</xml_diff>